<commit_message>
docs: bring CLAUDE.md up to date with the Vite build
CLAUDE.md still described a CDN/Babel app served by python http.server.
Describe the real setup: Vite entry points under src/, the build and
GitHub Pages deploy, products_data_with_lighting.js as the catalog's
data source, current tabs, tools and URL parameters. Point the guide at
the same data file and drop its note that CLAUDE.md was stale.

Co-Authored-By: Claude Opus 5.5 <noreply@anthropic.com>
Claude-Session: https://claude.ai/code/session_01CEKZouWypy9PaGASUvuBDG
</commit_message>
<xml_diff>
--- a/docs/HOW-IT-WORKS.docx
+++ b/docs/HOW-IT-WORKS.docx
@@ -2945,15 +2945,7 @@
           <w:rFonts w:ascii="Arial" w:cs="Arial" w:eastAsia="Arial" w:hAnsi="Arial"/>
           <w:rtl/>
         </w:rPr>
-        <w:t xml:space="preserve">ניהול מוצרים ממסך ניהול, במקום לערוך את </w:t>
-      </w:r>
-      <w:r>
-        <w:rPr>
-          <w:rFonts w:ascii="Consolas" w:cs="Consolas" w:eastAsia="Consolas" w:hAnsi="Consolas"/>
-          <w:color w:val="8A5A00"/>
-          <w:rtl/>
-        </w:rPr>
-        <w:t xml:space="preserve">products_data.js</w:t>
+        <w:t xml:space="preserve">ניהול מוצרים ממסך ניהול, במקום לערוך את קבצי המוצרים</w:t>
       </w:r>
     </w:p>
     <w:p>
@@ -3165,6 +3157,21 @@
                 <w:color w:val="8A5A00"/>
                 <w:rtl/>
               </w:rPr>
+              <w:t xml:space="preserve">products_data_with_lighting.js</w:t>
+            </w:r>
+            <w:r>
+              <w:rPr>
+                <w:rFonts w:ascii="Arial" w:cs="Arial" w:eastAsia="Arial" w:hAnsi="Arial"/>
+                <w:rtl/>
+              </w:rPr>
+              <w:t xml:space="preserve"> (הקטלוג טוען אותו), ועותקים ב-</w:t>
+            </w:r>
+            <w:r>
+              <w:rPr>
+                <w:rFonts w:ascii="Consolas" w:cs="Consolas" w:eastAsia="Consolas" w:hAnsi="Consolas"/>
+                <w:color w:val="8A5A00"/>
+                <w:rtl/>
+              </w:rPr>
               <w:t xml:space="preserve">products_data.js</w:t>
             </w:r>
             <w:r>
@@ -3172,7 +3179,7 @@
                 <w:rFonts w:ascii="Arial" w:cs="Arial" w:eastAsia="Arial" w:hAnsi="Arial"/>
                 <w:rtl/>
               </w:rPr>
-              <w:t xml:space="preserve">, </w:t>
+              <w:t xml:space="preserve"> ו-</w:t>
             </w:r>
             <w:r>
               <w:rPr>
@@ -3826,7 +3833,7 @@
                 <w:color w:val="8A5A00"/>
                 <w:rtl/>
               </w:rPr>
-              <w:t xml:space="preserve">products_data.js</w:t>
+              <w:t xml:space="preserve">products_data_with_lighting.js</w:t>
             </w:r>
             <w:r>
               <w:rPr>
@@ -3966,141 +3973,6 @@
       </w:tr>
     </w:tbl>
     <w:p/>
-    <w:p>
-      <w:pPr>
-        <w:pBdr>
-          <w:bottom w:val="single" w:color="E8A020" w:sz="6" w:space="1"/>
-        </w:pBdr>
-      </w:pPr>
-    </w:p>
-    <w:p>
-      <w:pPr>
-        <w:pStyle w:val="Heading1"/>
-        <w:bidi/>
-        <w:spacing w:after="120"/>
-        <w:jc w:val="right"/>
-      </w:pPr>
-      <w:r>
-        <w:rPr>
-          <w:rFonts w:ascii="Arial" w:cs="Arial" w:eastAsia="Arial" w:hAnsi="Arial"/>
-          <w:rtl/>
-        </w:rPr>
-        <w:t xml:space="preserve">הערה על CLAUDE.md</w:t>
-      </w:r>
-    </w:p>
-    <w:p>
-      <w:pPr>
-        <w:bidi/>
-        <w:spacing w:after="120"/>
-        <w:jc w:val="right"/>
-      </w:pPr>
-      <w:r>
-        <w:rPr>
-          <w:rFonts w:ascii="Consolas" w:cs="Consolas" w:eastAsia="Consolas" w:hAnsi="Consolas"/>
-          <w:color w:val="8A5A00"/>
-          <w:rtl/>
-        </w:rPr>
-        <w:t xml:space="preserve">CLAUDE.md</w:t>
-      </w:r>
-      <w:r>
-        <w:rPr>
-          <w:rFonts w:ascii="Arial" w:cs="Arial" w:eastAsia="Arial" w:hAnsi="Arial"/>
-          <w:rtl/>
-        </w:rPr>
-        <w:t xml:space="preserve"> עדיין כותב "אין build tools". זה כבר לא נכון: הפרויקט עבר ל-</w:t>
-      </w:r>
-      <w:r>
-        <w:rPr>
-          <w:rFonts w:ascii="Arial" w:cs="Arial" w:eastAsia="Arial" w:hAnsi="Arial"/>
-          <w:b/>
-          <w:bCs/>
-          <w:rtl/>
-        </w:rPr>
-        <w:t xml:space="preserve">Vite</w:t>
-      </w:r>
-      <w:r>
-        <w:rPr>
-          <w:rFonts w:ascii="Arial" w:cs="Arial" w:eastAsia="Arial" w:hAnsi="Arial"/>
-          <w:rtl/>
-        </w:rPr>
-        <w:t xml:space="preserve"> (</w:t>
-      </w:r>
-      <w:r>
-        <w:rPr>
-          <w:rFonts w:ascii="Consolas" w:cs="Consolas" w:eastAsia="Consolas" w:hAnsi="Consolas"/>
-          <w:color w:val="8A5A00"/>
-          <w:rtl/>
-        </w:rPr>
-        <w:t xml:space="preserve">vite.config.js</w:t>
-      </w:r>
-      <w:r>
-        <w:rPr>
-          <w:rFonts w:ascii="Arial" w:cs="Arial" w:eastAsia="Arial" w:hAnsi="Arial"/>
-          <w:rtl/>
-        </w:rPr>
-        <w:t xml:space="preserve">, </w:t>
-      </w:r>
-      <w:r>
-        <w:rPr>
-          <w:rFonts w:ascii="Consolas" w:cs="Consolas" w:eastAsia="Consolas" w:hAnsi="Consolas"/>
-          <w:color w:val="8A5A00"/>
-          <w:rtl/>
-        </w:rPr>
-        <w:t xml:space="preserve">package.json</w:t>
-      </w:r>
-      <w:r>
-        <w:rPr>
-          <w:rFonts w:ascii="Arial" w:cs="Arial" w:eastAsia="Arial" w:hAnsi="Arial"/>
-          <w:rtl/>
-        </w:rPr>
-        <w:t xml:space="preserve">), והאתר החי נבנה מ-</w:t>
-      </w:r>
-      <w:r>
-        <w:rPr>
-          <w:rFonts w:ascii="Consolas" w:cs="Consolas" w:eastAsia="Consolas" w:hAnsi="Consolas"/>
-          <w:color w:val="8A5A00"/>
-          <w:rtl/>
-        </w:rPr>
-        <w:t xml:space="preserve">dist/</w:t>
-      </w:r>
-      <w:r>
-        <w:rPr>
-          <w:rFonts w:ascii="Arial" w:cs="Arial" w:eastAsia="Arial" w:hAnsi="Arial"/>
-          <w:rtl/>
-        </w:rPr>
-        <w:t xml:space="preserve">. הריצה המקומית היא </w:t>
-      </w:r>
-      <w:r>
-        <w:rPr>
-          <w:rFonts w:ascii="Consolas" w:cs="Consolas" w:eastAsia="Consolas" w:hAnsi="Consolas"/>
-          <w:color w:val="8A5A00"/>
-          <w:rtl/>
-        </w:rPr>
-        <w:t xml:space="preserve">npm run dev</w:t>
-      </w:r>
-      <w:r>
-        <w:rPr>
-          <w:rFonts w:ascii="Arial" w:cs="Arial" w:eastAsia="Arial" w:hAnsi="Arial"/>
-          <w:rtl/>
-        </w:rPr>
-        <w:t xml:space="preserve"> ולא </w:t>
-      </w:r>
-      <w:r>
-        <w:rPr>
-          <w:rFonts w:ascii="Consolas" w:cs="Consolas" w:eastAsia="Consolas" w:hAnsi="Consolas"/>
-          <w:color w:val="8A5A00"/>
-          <w:rtl/>
-        </w:rPr>
-        <w:t xml:space="preserve">python -m http.server</w:t>
-      </w:r>
-      <w:r>
-        <w:rPr>
-          <w:rFonts w:ascii="Arial" w:cs="Arial" w:eastAsia="Arial" w:hAnsi="Arial"/>
-          <w:rtl/>
-        </w:rPr>
-        <w:t xml:space="preserve">.</w:t>
-      </w:r>
-    </w:p>
     <w:sectPr>
       <w:pgSz w:w="11906" w:h="16838" w:orient="portrait"/>
       <w:pgMar w:top="1200" w:right="1440" w:bottom="1200" w:left="1440" w:header="708" w:footer="708" w:gutter="0"/>

</xml_diff>